<commit_message>
Week 3: forward dynamics — lecture, supplement, Lab03, HW03
</commit_message>
<xml_diff>
--- a/homework/hw03/HW03_Assignment.docx
+++ b/homework/hw03/HW03_Assignment.docx
@@ -190,16 +190,15 @@
           <w:sz w:val="22"/>
           <w:szCs w:val="22"/>
         </w:rPr>
-        <w:t xml:space="preserve">Model A:</w:t>
-      </w:r>
-      <w:r>
-        <w:rPr>
-          <w:rFonts w:ascii="Cambria" w:cs="Cambria" w:eastAsia="Cambria" w:hAnsi="Cambria"/>
-          <w:color w:val="333333"/>
-          <w:sz w:val="22"/>
-          <w:szCs w:val="22"/>
-        </w:rPr>
-        <w:t xml:space="preserve"> Gribble muscle model + joint viscous damping (B = 3.0 N·m·s/rad), representing passive tissue viscosity</w:t>
+        <w:t>Model A: Gribble muscle model + joint viscous damping (B = 3.0 N·m·s/rad), the term added to the equations of motion in the lecture notes (§4, Eq 4.3), representing passive tissue viscosity</w:t>
+      </w:r>
+      <w:r>
+        <w:rPr>
+          <w:rFonts w:ascii="Cambria" w:cs="Cambria" w:eastAsia="Cambria" w:hAnsi="Cambria"/>
+          <w:color w:val="333333"/>
+          <w:sz w:val="22"/>
+          <w:szCs w:val="22"/>
+        </w:rPr>
       </w:r>
     </w:p>
     <w:p>
@@ -255,6 +254,58 @@
           <w:szCs w:val="22"/>
         </w:rPr>
         <w:t xml:space="preserve"> The same activation pattern will produce clean reaching in Model A but fail to settle in Model B. This reveals a fundamental limitation of direct activation and motivates the λ model (Week 4).</w:t>
+      </w:r>
+    </w:p>
+    <w:p>
+      <w:pPr>
+        <w:jc w:val="center"/>
+      </w:pPr>
+      <w:r>
+        <w:drawing>
+          <wp:inline xmlns:a="http://schemas.openxmlformats.org/drawingml/2006/main" xmlns:pic="http://schemas.openxmlformats.org/drawingml/2006/picture">
+            <wp:extent cx="4206240" cy="3505200"/>
+            <wp:docPr id="3" name="Picture 3"/>
+            <wp:cNvGraphicFramePr>
+              <a:graphicFrameLocks noChangeAspect="1"/>
+            </wp:cNvGraphicFramePr>
+            <a:graphic>
+              <a:graphicData uri="http://schemas.openxmlformats.org/drawingml/2006/picture">
+                <pic:pic>
+                  <pic:nvPicPr>
+                    <pic:cNvPr id="0" name="hw_reach_arm.png"/>
+                    <pic:cNvPicPr/>
+                  </pic:nvPicPr>
+                  <pic:blipFill>
+                    <a:blip r:embed="rId12"/>
+                    <a:stretch>
+                      <a:fillRect/>
+                    </a:stretch>
+                  </pic:blipFill>
+                  <pic:spPr>
+                    <a:xfrm>
+                      <a:off x="0" y="0"/>
+                      <a:ext cx="4206240" cy="3505200"/>
+                    </a:xfrm>
+                    <a:prstGeom prst="rect"/>
+                  </pic:spPr>
+                </pic:pic>
+              </a:graphicData>
+            </a:graphic>
+          </wp:inline>
+        </w:drawing>
+      </w:r>
+    </w:p>
+    <w:p>
+      <w:pPr>
+        <w:jc w:val="center"/>
+      </w:pPr>
+      <w:r>
+        <w:rPr>
+          <w:i/>
+          <w:color w:val="666666"/>
+          <w:sz w:val="18"/>
+        </w:rPr>
+        <w:t>The reaching task: the 2-link arm at the start (grey = end) posture with the six muscles overlaid, and the start/end hand positions of the ~5–8 cm reach. Muscle geometry follows lecture notes Figure 1; flexors and extensors sit on opposite sides of each joint, and the biarticular muscles (biceps-short, triceps-long) span both joints.</w:t>
       </w:r>
     </w:p>
     <w:tbl>
@@ -371,27 +422,25 @@
           <w:sz w:val="22"/>
           <w:szCs w:val="22"/>
         </w:rPr>
-        <w:t xml:space="preserve">You will need your completed </w:t>
-      </w:r>
-      <w:r>
-        <w:rPr>
-          <w:rFonts w:ascii="Cambria" w:cs="Cambria" w:eastAsia="Cambria" w:hAnsi="Cambria"/>
-          <w:b/>
-          <w:bCs/>
-          <w:color w:val="333333"/>
-          <w:sz w:val="22"/>
-          <w:szCs w:val="22"/>
-        </w:rPr>
-        <w:t xml:space="preserve">DynamicsEngine</w:t>
-      </w:r>
-      <w:r>
-        <w:rPr>
-          <w:rFonts w:ascii="Cambria" w:cs="Cambria" w:eastAsia="Cambria" w:hAnsi="Cambria"/>
-          <w:color w:val="333333"/>
-          <w:sz w:val="22"/>
-          <w:szCs w:val="22"/>
-        </w:rPr>
-        <w:t xml:space="preserve"> from Lab 03, including all supporting functions and the 6 Muscle objects. You will modify </w:t>
+        <w:t>You need the Week-3 plant: the reference Arm and Muscle and the supporting functions (mass_matrix, coriolis, rk4_step, muscle_length/velocity, compute_torques) and the two-phase DynamicsEngine from Lab 03. The homework notebook provides these (identical interface to Lab 03); you may substitute your own. From Week 4 they come from the smc package. This assignment builds on the Week-3 lecture notes: the plant (§2–§3), the equations of motion and the joint-damping term (§1 Eq 1.4, §4 Eq 4.3), the two-phase loop and DynamicsEngine (§7–§8), and interaction torques and co-contraction (§5, Figures 5–6).</w:t>
+      </w:r>
+      <w:r>
+        <w:rPr>
+          <w:rFonts w:ascii="Cambria" w:cs="Cambria" w:eastAsia="Cambria" w:hAnsi="Cambria"/>
+          <w:b/>
+          <w:bCs/>
+          <w:color w:val="333333"/>
+          <w:sz w:val="22"/>
+          <w:szCs w:val="22"/>
+        </w:rPr>
+      </w:r>
+      <w:r>
+        <w:rPr>
+          <w:rFonts w:ascii="Cambria" w:cs="Cambria" w:eastAsia="Cambria" w:hAnsi="Cambria"/>
+          <w:color w:val="333333"/>
+          <w:sz w:val="22"/>
+          <w:szCs w:val="22"/>
+        </w:rPr>
       </w:r>
       <w:r>
         <w:rPr>
@@ -400,16 +449,74 @@
           <w:sz w:val="20"/>
           <w:szCs w:val="20"/>
         </w:rPr>
-        <w:t xml:space="preserve">joint_accelerations</w:t>
-      </w:r>
-      <w:r>
-        <w:rPr>
-          <w:rFonts w:ascii="Cambria" w:cs="Cambria" w:eastAsia="Cambria" w:hAnsi="Cambria"/>
-          <w:color w:val="333333"/>
-          <w:sz w:val="22"/>
-          <w:szCs w:val="22"/>
-        </w:rPr>
-        <w:t xml:space="preserve"> to accept an optional damping parameter B.</w:t>
+      </w:r>
+      <w:r>
+        <w:rPr>
+          <w:rFonts w:ascii="Cambria" w:cs="Cambria" w:eastAsia="Cambria" w:hAnsi="Cambria"/>
+          <w:color w:val="333333"/>
+          <w:sz w:val="22"/>
+          <w:szCs w:val="22"/>
+        </w:rPr>
+      </w:r>
+    </w:p>
+    <w:p>
+      <w:r>
+        <w:rPr>
+          <w:i/>
+        </w:rPr>
+        <w:t>The notebook also provides scaffolding to help you design activation patterns: a muscle action map (below), an example triphasic schematic (Part 2), and a plot_activations(your_fn) helper you can call at any time to visualize your own pattern.</w:t>
+      </w:r>
+    </w:p>
+    <w:p>
+      <w:pPr>
+        <w:jc w:val="center"/>
+      </w:pPr>
+      <w:r>
+        <w:drawing>
+          <wp:inline xmlns:a="http://schemas.openxmlformats.org/drawingml/2006/main" xmlns:pic="http://schemas.openxmlformats.org/drawingml/2006/picture">
+            <wp:extent cx="5486400" cy="2560320"/>
+            <wp:docPr id="1" name="Picture 1"/>
+            <wp:cNvGraphicFramePr>
+              <a:graphicFrameLocks noChangeAspect="1"/>
+            </wp:cNvGraphicFramePr>
+            <a:graphic>
+              <a:graphicData uri="http://schemas.openxmlformats.org/drawingml/2006/picture">
+                <pic:pic>
+                  <pic:nvPicPr>
+                    <pic:cNvPr id="0" name="hw_muscle_map.png"/>
+                    <pic:cNvPicPr/>
+                  </pic:nvPicPr>
+                  <pic:blipFill>
+                    <a:blip r:embed="rId10"/>
+                    <a:stretch>
+                      <a:fillRect/>
+                    </a:stretch>
+                  </pic:blipFill>
+                  <pic:spPr>
+                    <a:xfrm>
+                      <a:off x="0" y="0"/>
+                      <a:ext cx="5486400" cy="2560320"/>
+                    </a:xfrm>
+                    <a:prstGeom prst="rect"/>
+                  </pic:spPr>
+                </pic:pic>
+              </a:graphicData>
+            </a:graphic>
+          </wp:inline>
+        </w:drawing>
+      </w:r>
+    </w:p>
+    <w:p>
+      <w:pPr>
+        <w:jc w:val="center"/>
+      </w:pPr>
+      <w:r>
+        <w:rPr>
+          <w:i/>
+          <w:color w:val="666666"/>
+          <w:sz w:val="18"/>
+        </w:rPr>
+        <w:t>Muscle action map: each muscle's moment arm at the shoulder and elbow (right = flexor, left = extensor). Biarticular muscles 2 (biceps-short) and 5 (triceps-long) act at both joints. Use this to choose muscle indices in Parts 1, 2, and 4.</w:t>
       </w:r>
     </w:p>
     <w:p>
@@ -427,6 +534,24 @@
           <w:szCs w:val="30"/>
         </w:rPr>
         <w:t xml:space="preserve">Part 1: Agonist Only — What Happens Without Braking? (15 pts)</w:t>
+      </w:r>
+    </w:p>
+    <w:p>
+      <w:pPr>
+        <w:pStyle w:val="Heading1"/>
+        <w:spacing w:after="200" w:before="360"/>
+      </w:pPr>
+      <w:r>
+        <w:rPr>
+          <w:rFonts w:ascii="Georgia" w:cs="Georgia" w:eastAsia="Georgia" w:hAnsi="Georgia"/>
+          <w:b/>
+          <w:bCs/>
+          <w:i/>
+          <w:color w:val="1B2A4A"/>
+          <w:sz w:val="30"/>
+          <w:szCs w:val="30"/>
+        </w:rPr>
+        <w:t>Lecture notes §5 (interaction torques): a torque at one joint accelerates both. Model A's damping is the B·dq/dt term of §4, Eq 4.3.</w:t>
       </w:r>
     </w:p>
     <w:p>
@@ -581,6 +706,76 @@
     </w:p>
     <w:p>
       <w:pPr>
+        <w:pStyle w:val="Heading1"/>
+        <w:spacing w:after="200" w:before="360"/>
+      </w:pPr>
+      <w:r>
+        <w:rPr>
+          <w:rFonts w:ascii="Georgia" w:cs="Georgia" w:eastAsia="Georgia" w:hAnsi="Georgia"/>
+          <w:b/>
+          <w:bCs/>
+          <w:i/>
+          <w:color w:val="1B2A4A"/>
+          <w:sz w:val="30"/>
+          <w:szCs w:val="30"/>
+        </w:rPr>
+        <w:t>Lecture notes §5 (triphasic motivation) and §7 (the two-phase loop). The antagonist overlap anticipates the calcium delay (§5).</w:t>
+      </w:r>
+    </w:p>
+    <w:p>
+      <w:pPr>
+        <w:jc w:val="center"/>
+      </w:pPr>
+      <w:r>
+        <w:drawing>
+          <wp:inline xmlns:a="http://schemas.openxmlformats.org/drawingml/2006/main" xmlns:pic="http://schemas.openxmlformats.org/drawingml/2006/picture">
+            <wp:extent cx="5486400" cy="3825877"/>
+            <wp:docPr id="2" name="Picture 2"/>
+            <wp:cNvGraphicFramePr>
+              <a:graphicFrameLocks noChangeAspect="1"/>
+            </wp:cNvGraphicFramePr>
+            <a:graphic>
+              <a:graphicData uri="http://schemas.openxmlformats.org/drawingml/2006/picture">
+                <pic:pic>
+                  <pic:nvPicPr>
+                    <pic:cNvPr id="0" name="hw_triphasic_schematic.png"/>
+                    <pic:cNvPicPr/>
+                  </pic:nvPicPr>
+                  <pic:blipFill>
+                    <a:blip r:embed="rId11"/>
+                    <a:stretch>
+                      <a:fillRect/>
+                    </a:stretch>
+                  </pic:blipFill>
+                  <pic:spPr>
+                    <a:xfrm>
+                      <a:off x="0" y="0"/>
+                      <a:ext cx="5486400" cy="3825877"/>
+                    </a:xfrm>
+                    <a:prstGeom prst="rect"/>
+                  </pic:spPr>
+                </pic:pic>
+              </a:graphicData>
+            </a:graphic>
+          </wp:inline>
+        </w:drawing>
+      </w:r>
+    </w:p>
+    <w:p>
+      <w:pPr>
+        <w:jc w:val="center"/>
+      </w:pPr>
+      <w:r>
+        <w:rPr>
+          <w:i/>
+          <w:color w:val="666666"/>
+          <w:sz w:val="18"/>
+        </w:rPr>
+        <w:t>The triphasic activation pattern you will design (example values). Note the antagonist burst begins before the agonist ends — anticipating the calcium delay. Call plot_activations() on your own function to compare.</w:t>
+      </w:r>
+    </w:p>
+    <w:p>
+      <w:pPr>
         <w:pStyle w:val="Heading2"/>
         <w:pBdr>
           <w:bottom w:val="single" w:color="2E86AB" w:sz="1" w:space="4"/>
@@ -770,6 +965,24 @@
     </w:p>
     <w:p>
       <w:pPr>
+        <w:pStyle w:val="Heading1"/>
+        <w:spacing w:after="200" w:before="360"/>
+      </w:pPr>
+      <w:r>
+        <w:rPr>
+          <w:rFonts w:ascii="Georgia" w:cs="Georgia" w:eastAsia="Georgia" w:hAnsi="Georgia"/>
+          <w:b/>
+          <w:bCs/>
+          <w:i/>
+          <w:color w:val="1B2A4A"/>
+          <w:sz w:val="30"/>
+          <w:szCs w:val="30"/>
+        </w:rPr>
+        <w:t>Lecture notes §4, Eq 4.3: Model B drops the B·dq/dt term, so nothing dissipates residual velocity once the bursts end.</w:t>
+      </w:r>
+    </w:p>
+    <w:p>
+      <w:pPr>
         <w:pStyle w:val="Heading2"/>
         <w:pBdr>
           <w:bottom w:val="single" w:color="2E86AB" w:sz="1" w:space="4"/>
@@ -940,6 +1153,24 @@
     </w:p>
     <w:p>
       <w:pPr>
+        <w:pStyle w:val="Heading1"/>
+        <w:spacing w:after="200" w:before="360"/>
+      </w:pPr>
+      <w:r>
+        <w:rPr>
+          <w:rFonts w:ascii="Georgia" w:cs="Georgia" w:eastAsia="Georgia" w:hAnsi="Georgia"/>
+          <w:b/>
+          <w:bCs/>
+          <w:i/>
+          <w:color w:val="1B2A4A"/>
+          <w:sz w:val="30"/>
+          <w:szCs w:val="30"/>
+        </w:rPr>
+        <w:t>Lecture notes §5 and Figure 6: co-contraction adds damping via the force–velocity asymmetry but no stiffness (Lab 03 Extra B).</w:t>
+      </w:r>
+    </w:p>
+    <w:p>
+      <w:pPr>
         <w:pStyle w:val="Heading2"/>
         <w:pBdr>
           <w:bottom w:val="single" w:color="2E86AB" w:sz="1" w:space="4"/>
@@ -1092,6 +1323,24 @@
           <w:szCs w:val="30"/>
         </w:rPr>
         <w:t xml:space="preserve">Part 5: HW02 Comparison + Write-Up (25 pts)</w:t>
+      </w:r>
+    </w:p>
+    <w:p>
+      <w:pPr>
+        <w:pStyle w:val="Heading1"/>
+        <w:spacing w:after="200" w:before="360"/>
+      </w:pPr>
+      <w:r>
+        <w:rPr>
+          <w:rFonts w:ascii="Georgia" w:cs="Georgia" w:eastAsia="Georgia" w:hAnsi="Georgia"/>
+          <w:b/>
+          <w:bCs/>
+          <w:i/>
+          <w:color w:val="1B2A4A"/>
+          <w:sz w:val="30"/>
+          <w:szCs w:val="30"/>
+        </w:rPr>
+        <w:t>Lecture notes §3–§5: the full simulation includes interaction and Coriolis torques and configuration-dependent inertia that the HW02 estimate ignores.</w:t>
       </w:r>
     </w:p>
     <w:p>

</xml_diff>

<commit_message>
Correct passive stiffness k across smc and Weeks 3-4
smc 0.2.0 -> 0.3.0: bic_l 150->190.9, bic_s 100->36.5, tri_l 200->209.9,
tri_lg 100->116.3, matching Gribble et al. (1998) p.1411 and restoring
k/PCSA = 17.35 for all six muscles. Add mu parameter to the lambda
force path; add lambda_for_equilibrium and equilibrium_posture; fix the
lambda_for_posture docstring. Update Lab03, HW03, Lab04 and the Week 4
lecture, which quoted the old values (1.05 -> 1.04 N.m/rad).
No conclusions change.
</commit_message>
<xml_diff>
--- a/homework/hw03/HW03_Assignment.docx
+++ b/homework/hw03/HW03_Assignment.docx
@@ -129,47 +129,43 @@
           <w:sz w:val="22"/>
           <w:szCs w:val="22"/>
         </w:rPr>
-        <w:t xml:space="preserve">You want to reach a target 5–8 cm away and </w:t>
-      </w:r>
-      <w:r>
-        <w:rPr>
-          <w:rFonts w:ascii="Cambria" w:cs="Cambria" w:eastAsia="Cambria" w:hAnsi="Cambria"/>
-          <w:b/>
-          <w:bCs/>
-          <w:color w:val="333333"/>
-          <w:sz w:val="22"/>
-          <w:szCs w:val="22"/>
-        </w:rPr>
-        <w:t xml:space="preserve">stop</w:t>
-      </w:r>
-      <w:r>
-        <w:rPr>
-          <w:rFonts w:ascii="Cambria" w:cs="Cambria" w:eastAsia="Cambria" w:hAnsi="Cambria"/>
-          <w:color w:val="333333"/>
-          <w:sz w:val="22"/>
-          <w:szCs w:val="22"/>
-        </w:rPr>
-        <w:t xml:space="preserve">. This requires the </w:t>
-      </w:r>
-      <w:r>
-        <w:rPr>
-          <w:rFonts w:ascii="Cambria" w:cs="Cambria" w:eastAsia="Cambria" w:hAnsi="Cambria"/>
-          <w:b/>
-          <w:bCs/>
-          <w:color w:val="333333"/>
-          <w:sz w:val="22"/>
-          <w:szCs w:val="22"/>
-        </w:rPr>
-        <w:t xml:space="preserve">triphasic pattern</w:t>
-      </w:r>
-      <w:r>
-        <w:rPr>
-          <w:rFonts w:ascii="Cambria" w:cs="Cambria" w:eastAsia="Cambria" w:hAnsi="Cambria"/>
-          <w:color w:val="333333"/>
-          <w:sz w:val="22"/>
-          <w:szCs w:val="22"/>
-        </w:rPr>
-        <w:t xml:space="preserve">: an agonist burst to accelerate, an antagonist burst to brake, and a co-contraction hold to stabilize. You will design this pattern and test it on two versions of the arm model:</w:t>
+        <w:t>You want to reach a target 5–8 cm away and stop. This requires the triphasic pattern: an agonist burst to accelerate, an antagonist burst to brake, and a co-contraction hold to stabilize. The movement you are aiming for is a ballistic reach — the hand accelerates smoothly to a peak speed and decelerates just as smoothly, so its velocity profile has a single peak and is roughly symmetric (a bell shape). Cooke and Brown (1990) describe exactly this for step-tracking movements. You will design this pattern and test it on two versions of the arm model:</w:t>
+      </w:r>
+      <w:r>
+        <w:rPr>
+          <w:rFonts w:ascii="Cambria" w:cs="Cambria" w:eastAsia="Cambria" w:hAnsi="Cambria"/>
+          <w:b/>
+          <w:bCs/>
+          <w:color w:val="333333"/>
+          <w:sz w:val="22"/>
+          <w:szCs w:val="22"/>
+        </w:rPr>
+      </w:r>
+      <w:r>
+        <w:rPr>
+          <w:rFonts w:ascii="Cambria" w:cs="Cambria" w:eastAsia="Cambria" w:hAnsi="Cambria"/>
+          <w:color w:val="333333"/>
+          <w:sz w:val="22"/>
+          <w:szCs w:val="22"/>
+        </w:rPr>
+      </w:r>
+      <w:r>
+        <w:rPr>
+          <w:rFonts w:ascii="Cambria" w:cs="Cambria" w:eastAsia="Cambria" w:hAnsi="Cambria"/>
+          <w:b/>
+          <w:bCs/>
+          <w:color w:val="333333"/>
+          <w:sz w:val="22"/>
+          <w:szCs w:val="22"/>
+        </w:rPr>
+      </w:r>
+      <w:r>
+        <w:rPr>
+          <w:rFonts w:ascii="Cambria" w:cs="Cambria" w:eastAsia="Cambria" w:hAnsi="Cambria"/>
+          <w:color w:val="333333"/>
+          <w:sz w:val="22"/>
+          <w:szCs w:val="22"/>
+        </w:rPr>
       </w:r>
     </w:p>
     <w:p>
@@ -244,16 +240,15 @@
           <w:sz w:val="22"/>
           <w:szCs w:val="22"/>
         </w:rPr>
-        <w:t xml:space="preserve">The prediction:</w:t>
-      </w:r>
-      <w:r>
-        <w:rPr>
-          <w:rFonts w:ascii="Cambria" w:cs="Cambria" w:eastAsia="Cambria" w:hAnsi="Cambria"/>
-          <w:color w:val="333333"/>
-          <w:sz w:val="22"/>
-          <w:szCs w:val="22"/>
-        </w:rPr>
-        <w:t xml:space="preserve"> The same activation pattern will produce clean reaching in Model A but fail to settle in Model B. This reveals a fundamental limitation of direct activation and motivates the λ model (Week 4).</w:t>
+        <w:t>The prediction: the same activation pattern will produce a clean ballistic reach in Model A but will fail to settle in Model B. That failure is the sharpest motivation for the λ model (Week 4).</w:t>
+      </w:r>
+      <w:r>
+        <w:rPr>
+          <w:rFonts w:ascii="Cambria" w:cs="Cambria" w:eastAsia="Cambria" w:hAnsi="Cambria"/>
+          <w:color w:val="333333"/>
+          <w:sz w:val="22"/>
+          <w:szCs w:val="22"/>
+        </w:rPr>
       </w:r>
     </w:p>
     <w:p>
@@ -464,7 +459,7 @@
         <w:rPr>
           <w:i/>
         </w:rPr>
-        <w:t>The notebook also provides scaffolding to help you design activation patterns: a muscle action map (below), an example triphasic schematic (Part 2), and a plot_activations(your_fn) helper you can call at any time to visualize your own pattern.</w:t>
+        <w:t>The notebook also provides scaffolding: a muscle action map (below), an example triphasic schematic, and a plot_activations(your_fn) helper. It also runs three short demonstrations for you — no action needed.</w:t>
       </w:r>
     </w:p>
     <w:p>
@@ -533,7 +528,25 @@
           <w:sz w:val="30"/>
           <w:szCs w:val="30"/>
         </w:rPr>
-        <w:t xml:space="preserve">Part 1: Agonist Only — What Happens Without Braking? (15 pts)</w:t>
+        <w:t>Task 1 — Build a Ballistic Reach That Works (40 pts)</w:t>
+      </w:r>
+    </w:p>
+    <w:p>
+      <w:pPr>
+        <w:pStyle w:val="Heading1"/>
+        <w:spacing w:after="200" w:before="360"/>
+      </w:pPr>
+      <w:r>
+        <w:rPr>
+          <w:rFonts w:ascii="Georgia" w:cs="Georgia" w:eastAsia="Georgia" w:hAnsi="Georgia"/>
+          <w:b w:val="0"/>
+          <w:bCs/>
+          <w:i/>
+          <w:color w:val="444444"/>
+          <w:sz w:val="20"/>
+          <w:szCs w:val="30"/>
+        </w:rPr>
+        <w:t>Objective. Produce a realistic ballistic reach on the damped plant, and learn the two facts that constrain the design — muscle force lags the command by 58 ms, so the brake must be commanded early; and co-contraction supplies no stiffness, so holding a position requires an asymmetric command.</w:t>
       </w:r>
     </w:p>
     <w:p>
@@ -551,7 +564,7 @@
           <w:sz w:val="30"/>
           <w:szCs w:val="30"/>
         </w:rPr>
-        <w:t>Lecture notes §5 (interaction torques): a torque at one joint accelerates both. Model A's damping is the B·dq/dt term of §4, Eq 4.3.</w:t>
+        <w:t>Lecture notes §4, Eq 4.3 (the joint-damping term) and §7 (the two-phase loop). HW02 supplies the 58 ms activation delay.</w:t>
       </w:r>
     </w:p>
     <w:p>
@@ -571,21 +584,7 @@
           <w:sz w:val="24"/>
           <w:szCs w:val="24"/>
         </w:rPr>
-        <w:t xml:space="preserve">Task 1.1 — Design Agonist Pulse (5 pts)</w:t>
-      </w:r>
-    </w:p>
-    <w:p>
-      <w:pPr>
-        <w:spacing w:after="160" w:line="300"/>
-      </w:pPr>
-      <w:r>
-        <w:rPr>
-          <w:rFonts w:ascii="Cambria" w:cs="Cambria" w:eastAsia="Cambria" w:hAnsi="Cambria"/>
-          <w:color w:val="333333"/>
-          <w:sz w:val="22"/>
-          <w:szCs w:val="22"/>
-        </w:rPr>
-        <w:t xml:space="preserve">COMPLETE an activation function: pectoralis (a = 1.0) and biceps short (a = 0.4) from 20–200 ms.</w:t>
+        <w:t>1a. Add Joint Damping to the Equations of Motion (10 pts)</w:t>
       </w:r>
     </w:p>
     <w:p>
@@ -599,13 +598,14 @@
       <w:r>
         <w:rPr>
           <w:rFonts w:ascii="Georgia" w:cs="Georgia" w:eastAsia="Georgia" w:hAnsi="Georgia"/>
-          <w:b/>
-          <w:bCs/>
-          <w:color w:val="2E86AB"/>
-          <w:sz w:val="24"/>
+          <w:b w:val="0"/>
+          <w:bCs/>
+          <w:i/>
+          <w:color w:val="444444"/>
+          <w:sz w:val="20"/>
           <w:szCs w:val="24"/>
         </w:rPr>
-        <w:t xml:space="preserve">Task 1.2 — Simulate on Both Models (5 pts)</w:t>
+        <w:t>Objective. Implement the single term that distinguishes Model A from Model B.</w:t>
       </w:r>
     </w:p>
     <w:p>
@@ -619,7 +619,7 @@
           <w:sz w:val="22"/>
           <w:szCs w:val="22"/>
         </w:rPr>
-        <w:t xml:space="preserve">COMPLETE simulations for Model A (B = 3.0) and Model B (B = 0) for 1 second. Plot displacement vs. time.</w:t>
+        <w:t>Model A and Model B differ by exactly one term. From lecture Eq 4.3, M q̈ + C q̇ + B q̇ = τ, so q̈ = M⁻¹[τ − C − B q̇]. COMPLETE the damping term. A provided check verifies that with B = 0 you recover Lab 03's values.</w:t>
       </w:r>
     </w:p>
     <w:p>
@@ -639,7 +639,28 @@
           <w:sz w:val="24"/>
           <w:szCs w:val="24"/>
         </w:rPr>
-        <w:t xml:space="preserve">Question 1.1 (5 pts)</w:t>
+        <w:t>1b. Three Provided Demonstrations (no action needed)</w:t>
+      </w:r>
+    </w:p>
+    <w:p>
+      <w:pPr>
+        <w:pStyle w:val="Heading2"/>
+        <w:pBdr>
+          <w:bottom w:val="single" w:color="2E86AB" w:sz="1" w:space="4"/>
+        </w:pBdr>
+        <w:spacing w:after="160" w:before="300"/>
+      </w:pPr>
+      <w:r>
+        <w:rPr>
+          <w:rFonts w:ascii="Georgia" w:cs="Georgia" w:eastAsia="Georgia" w:hAnsi="Georgia"/>
+          <w:b w:val="0"/>
+          <w:bCs/>
+          <w:i/>
+          <w:color w:val="444444"/>
+          <w:sz w:val="20"/>
+          <w:szCs w:val="24"/>
+        </w:rPr>
+        <w:t>Objective. Establish the three facts your design has to respect, before you start tuning. Nothing to complete.</w:t>
       </w:r>
     </w:p>
     <w:p>
@@ -649,77 +670,11 @@
       <w:r>
         <w:rPr>
           <w:rFonts w:ascii="Cambria" w:cs="Cambria" w:eastAsia="Cambria" w:hAnsi="Cambria"/>
-          <w:b/>
-          <w:bCs/>
-          <w:color w:val="333333"/>
-          <w:sz w:val="22"/>
-          <w:szCs w:val="22"/>
-        </w:rPr>
-        <w:t xml:space="preserve">(a)</w:t>
-      </w:r>
-      <w:r>
-        <w:rPr>
-          <w:rFonts w:ascii="Cambria" w:cs="Cambria" w:eastAsia="Cambria" w:hAnsi="Cambria"/>
-          <w:color w:val="333333"/>
-          <w:sz w:val="22"/>
-          <w:szCs w:val="22"/>
-        </w:rPr>
-        <w:t xml:space="preserve"> Why does Model A decelerate without braking? </w:t>
-      </w:r>
-      <w:r>
-        <w:rPr>
-          <w:rFonts w:ascii="Cambria" w:cs="Cambria" w:eastAsia="Cambria" w:hAnsi="Cambria"/>
-          <w:b/>
-          <w:bCs/>
-          <w:color w:val="333333"/>
-          <w:sz w:val="22"/>
-          <w:szCs w:val="22"/>
-        </w:rPr>
-        <w:t xml:space="preserve">(b)</w:t>
-      </w:r>
-      <w:r>
-        <w:rPr>
-          <w:rFonts w:ascii="Cambria" w:cs="Cambria" w:eastAsia="Cambria" w:hAnsi="Cambria"/>
-          <w:color w:val="333333"/>
-          <w:sz w:val="22"/>
-          <w:szCs w:val="22"/>
-        </w:rPr>
-        <w:t xml:space="preserve"> Why is Model B’s force-velocity damping insufficient?</w:t>
-      </w:r>
-    </w:p>
-    <w:p>
-      <w:pPr>
-        <w:pStyle w:val="Heading1"/>
-        <w:spacing w:after="200" w:before="360"/>
-      </w:pPr>
-      <w:r>
-        <w:rPr>
-          <w:rFonts w:ascii="Georgia" w:cs="Georgia" w:eastAsia="Georgia" w:hAnsi="Georgia"/>
-          <w:b/>
-          <w:bCs/>
-          <w:color w:val="1B2A4A"/>
-          <w:sz w:val="30"/>
-          <w:szCs w:val="30"/>
-        </w:rPr>
-        <w:t xml:space="preserve">Part 2: Design the Triphasic Reach — Model A (25 pts)</w:t>
-      </w:r>
-    </w:p>
-    <w:p>
-      <w:pPr>
-        <w:pStyle w:val="Heading1"/>
-        <w:spacing w:after="200" w:before="360"/>
-      </w:pPr>
-      <w:r>
-        <w:rPr>
-          <w:rFonts w:ascii="Georgia" w:cs="Georgia" w:eastAsia="Georgia" w:hAnsi="Georgia"/>
-          <w:b/>
-          <w:bCs/>
-          <w:i/>
-          <w:color w:val="1B2A4A"/>
-          <w:sz w:val="30"/>
-          <w:szCs w:val="30"/>
-        </w:rPr>
-        <w:t>Lecture notes §5 (triphasic motivation) and §7 (the two-phase loop). The antagonist overlap anticipates the calcium delay (§5).</w:t>
+          <w:color w:val="333333"/>
+          <w:sz w:val="22"/>
+          <w:szCs w:val="22"/>
+        </w:rPr>
+        <w:t>Run these before designing. (1) An agonist burst alone never stops where you want it. (2) The muscle is slow: force reaches 90% of steady state 58 ms after the command — the number you measured in HW02, and the reason the antagonist must be commanded early. (3) A co-contraction cannot hold a position, because it adds no stiffness: under direct activation a muscle's active force depends only on the command, never on its length, so it cannot resist being displaced (Lab 03 Extra B: stiffness flat at ~1.05 N·m/rad at every activation level). Over 4 s the hand keeps only about a third of its reach.</w:t>
       </w:r>
     </w:p>
     <w:p>
@@ -771,7 +726,7 @@
           <w:color w:val="666666"/>
           <w:sz w:val="18"/>
         </w:rPr>
-        <w:t>The triphasic activation pattern you will design (example values). Note the antagonist burst begins before the agonist ends — anticipating the calcium delay. Call plot_activations() on your own function to compare.</w:t>
+        <w:t>The triphasic pattern you will build. AG1 accelerates; ANT brakes and is commanded at 130 ms, before AG1 ends, to cover the 58 ms activation delay; a tonic hold then stabilizes.</w:t>
       </w:r>
     </w:p>
     <w:p>
@@ -791,21 +746,7 @@
           <w:sz w:val="24"/>
           <w:szCs w:val="24"/>
         </w:rPr>
-        <w:t xml:space="preserve">Task 2.1 — Add Antagonist Braking (10 pts)</w:t>
-      </w:r>
-    </w:p>
-    <w:p>
-      <w:pPr>
-        <w:spacing w:after="160" w:line="300"/>
-      </w:pPr>
-      <w:r>
-        <w:rPr>
-          <w:rFonts w:ascii="Cambria" w:cs="Cambria" w:eastAsia="Cambria" w:hAnsi="Cambria"/>
-          <w:color w:val="333333"/>
-          <w:sz w:val="22"/>
-          <w:szCs w:val="22"/>
-        </w:rPr>
-        <w:t xml:space="preserve">Add antagonist burst (deltoid + triceps long) overlapping the agonist’s end. COMPLETE and simulate.</w:t>
+        <w:t>1c. Tune the Reach (30 pts)</w:t>
       </w:r>
     </w:p>
     <w:p>
@@ -819,13 +760,14 @@
       <w:r>
         <w:rPr>
           <w:rFonts w:ascii="Georgia" w:cs="Georgia" w:eastAsia="Georgia" w:hAnsi="Georgia"/>
-          <w:b/>
-          <w:bCs/>
-          <w:color w:val="2E86AB"/>
-          <w:sz w:val="24"/>
+          <w:b w:val="0"/>
+          <w:bCs/>
+          <w:i/>
+          <w:color w:val="444444"/>
+          <w:sz w:val="20"/>
           <w:szCs w:val="24"/>
         </w:rPr>
-        <w:t xml:space="preserve">Task 2.2 — Add Co-Contraction Hold (5 pts)</w:t>
+        <w:t>Objective. Produce a movement that reaches the target, holds it, and has a realistic (single-peaked, roughly symmetric) velocity profile.</w:t>
       </w:r>
     </w:p>
     <w:p>
@@ -839,7 +781,7 @@
           <w:sz w:val="22"/>
           <w:szCs w:val="22"/>
         </w:rPr>
-        <w:t xml:space="preserve">Add sustained symmetric co-contraction after the antagonist burst to stabilize the arm.</w:t>
+        <w:t>AG1 is given and works. You choose two things: how hard to brake, and the tonic hold. Your movement must (1) reach ≥ 5 cm, (2) HOLD it (final ≥ 90% of peak — what demonstration 3 failed), (3) settle below 1 cm/s, and (4) be bell-shaped: a single velocity peak with roughly equal time accelerating and decelerating (symmetry 0.4–0.6). Holding position needs an ASYMMETRIC hold — slightly more agonist than antagonist — so a steady net torque balances the passive springs. The provided cell checks all four criteria. (Week 5 quantifies the bell shape with the minimum-jerk model; here you only need to see it.)</w:t>
       </w:r>
     </w:p>
     <w:p>
@@ -859,7 +801,7 @@
           <w:sz w:val="24"/>
           <w:szCs w:val="24"/>
         </w:rPr>
-        <w:t xml:space="preserve">Task 2.3 — Tune the Pattern (5 pts)</w:t>
+        <w:t>Question 1</w:t>
       </w:r>
     </w:p>
     <w:p>
@@ -873,7 +815,62 @@
           <w:sz w:val="22"/>
           <w:szCs w:val="22"/>
         </w:rPr>
-        <w:t xml:space="preserve">Tune parameters: ≥5 cm reach, velocity &lt;1 cm/s within 800 ms, stable final position.</w:t>
+        <w:t>(a) Why must the antagonist be commanded before the agonist ends? Give the number you measured in HW02 and show it is consistent with your timing.  (b) Demonstration 3's symmetric hold lost most of its reach and your hold had to be asymmetric — explain why, using what Lab 03 measured about stiffness under direct activation.</w:t>
+      </w:r>
+    </w:p>
+    <w:p>
+      <w:pPr>
+        <w:pStyle w:val="Heading1"/>
+        <w:pBdr>
+          <w:bottom w:val="single" w:color="2E86AB" w:sz="1" w:space="4"/>
+        </w:pBdr>
+        <w:spacing w:after="160" w:before="300"/>
+      </w:pPr>
+      <w:r>
+        <w:rPr>
+          <w:rFonts w:ascii="Georgia" w:cs="Georgia" w:eastAsia="Georgia" w:hAnsi="Georgia"/>
+          <w:b/>
+          <w:bCs/>
+          <w:color w:val="2E86AB"/>
+          <w:sz w:val="24"/>
+          <w:szCs w:val="24"/>
+        </w:rPr>
+        <w:t>Task 2 — Break It: The Same Pattern on Model B (20 pts)</w:t>
+      </w:r>
+    </w:p>
+    <w:p>
+      <w:pPr>
+        <w:pStyle w:val="Heading1"/>
+        <w:pBdr>
+          <w:bottom w:val="single" w:color="2E86AB" w:sz="1" w:space="4"/>
+        </w:pBdr>
+        <w:spacing w:after="160" w:before="300"/>
+      </w:pPr>
+      <w:r>
+        <w:rPr>
+          <w:rFonts w:ascii="Georgia" w:cs="Georgia" w:eastAsia="Georgia" w:hAnsi="Georgia"/>
+          <w:b w:val="0"/>
+          <w:bCs/>
+          <w:i/>
+          <w:color w:val="444444"/>
+          <w:sz w:val="20"/>
+          <w:szCs w:val="24"/>
+        </w:rPr>
+        <w:t>Objective. Show that the identical command fails once the damping is removed, and identify precisely what Model B lacks.</w:t>
+      </w:r>
+    </w:p>
+    <w:p>
+      <w:pPr>
+        <w:spacing w:after="160" w:line="300"/>
+      </w:pPr>
+      <w:r>
+        <w:rPr>
+          <w:rFonts w:ascii="Cambria" w:cs="Cambria" w:eastAsia="Cambria" w:hAnsi="Cambria"/>
+          <w:color w:val="333333"/>
+          <w:sz w:val="22"/>
+          <w:szCs w:val="22"/>
+        </w:rPr>
+        <w:t>Lecture notes §4, Eq 4.3: Model B drops the B·dq/dt term, so nothing dissipates residual velocity once the bursts end. Change exactly one thing — remove the joint damping — and run the identical activation pattern. A provided two-panel figure compares displacement and velocity.</w:t>
       </w:r>
     </w:p>
     <w:p>
@@ -893,7 +890,7 @@
           <w:sz w:val="24"/>
           <w:szCs w:val="24"/>
         </w:rPr>
-        <w:t xml:space="preserve">Question 2.1 (5 pts)</w:t>
+        <w:t>Question 2</w:t>
       </w:r>
     </w:p>
     <w:p>
@@ -909,36 +906,33 @@
           <w:sz w:val="22"/>
           <w:szCs w:val="22"/>
         </w:rPr>
-        <w:t xml:space="preserve">(a)</w:t>
-      </w:r>
-      <w:r>
-        <w:rPr>
-          <w:rFonts w:ascii="Cambria" w:cs="Cambria" w:eastAsia="Cambria" w:hAnsi="Cambria"/>
-          <w:color w:val="333333"/>
-          <w:sz w:val="22"/>
-          <w:szCs w:val="22"/>
-        </w:rPr>
-        <w:t xml:space="preserve"> Why must the antagonist start before the agonist ends? </w:t>
-      </w:r>
-      <w:r>
-        <w:rPr>
-          <w:rFonts w:ascii="Cambria" w:cs="Cambria" w:eastAsia="Cambria" w:hAnsi="Cambria"/>
-          <w:b/>
-          <w:bCs/>
-          <w:color w:val="333333"/>
-          <w:sz w:val="22"/>
-          <w:szCs w:val="22"/>
-        </w:rPr>
-        <w:t xml:space="preserve">(b)</w:t>
-      </w:r>
-      <w:r>
-        <w:rPr>
-          <w:rFonts w:ascii="Cambria" w:cs="Cambria" w:eastAsia="Cambria" w:hAnsi="Cambria"/>
-          <w:color w:val="333333"/>
-          <w:sz w:val="22"/>
-          <w:szCs w:val="22"/>
-        </w:rPr>
-        <w:t xml:space="preserve"> What happens without the hold phase?</w:t>
+        <w:t>(a) Describe the difference. Does Model B overshoot? Does it settle?  (b) The antagonist briefly reduces Model B's velocity, then it drifts again — why? What does Model B lack that Model A has?</w:t>
+      </w:r>
+      <w:r>
+        <w:rPr>
+          <w:rFonts w:ascii="Cambria" w:cs="Cambria" w:eastAsia="Cambria" w:hAnsi="Cambria"/>
+          <w:color w:val="333333"/>
+          <w:sz w:val="22"/>
+          <w:szCs w:val="22"/>
+        </w:rPr>
+      </w:r>
+      <w:r>
+        <w:rPr>
+          <w:rFonts w:ascii="Cambria" w:cs="Cambria" w:eastAsia="Cambria" w:hAnsi="Cambria"/>
+          <w:b/>
+          <w:bCs/>
+          <w:color w:val="333333"/>
+          <w:sz w:val="22"/>
+          <w:szCs w:val="22"/>
+        </w:rPr>
+      </w:r>
+      <w:r>
+        <w:rPr>
+          <w:rFonts w:ascii="Cambria" w:cs="Cambria" w:eastAsia="Cambria" w:hAnsi="Cambria"/>
+          <w:color w:val="333333"/>
+          <w:sz w:val="22"/>
+          <w:szCs w:val="22"/>
+        </w:rPr>
       </w:r>
     </w:p>
     <w:p>
@@ -960,7 +954,25 @@
           <w:sz w:val="30"/>
           <w:szCs w:val="30"/>
         </w:rPr>
-        <w:t xml:space="preserve">Part 3: The Same Pattern on Model B — It Fails (20 pts)</w:t>
+        <w:t>Task 3 — Can Co-Contraction Rescue Model B? (20 pts)</w:t>
+      </w:r>
+    </w:p>
+    <w:p>
+      <w:pPr>
+        <w:pStyle w:val="Heading1"/>
+        <w:spacing w:after="200" w:before="360"/>
+      </w:pPr>
+      <w:r>
+        <w:rPr>
+          <w:rFonts w:ascii="Georgia" w:cs="Georgia" w:eastAsia="Georgia" w:hAnsi="Georgia"/>
+          <w:b w:val="0"/>
+          <w:bCs/>
+          <w:i/>
+          <w:color w:val="444444"/>
+          <w:sz w:val="20"/>
+          <w:szCs w:val="30"/>
+        </w:rPr>
+        <w:t>Objective. Test the obvious fix. Find out what co-contraction does supply (some damping), what it does not (any stiffness), and why that leaves the problem unsolved.</w:t>
       </w:r>
     </w:p>
     <w:p>
@@ -978,7 +990,39 @@
           <w:sz w:val="30"/>
           <w:szCs w:val="30"/>
         </w:rPr>
-        <w:t>Lecture notes §4, Eq 4.3: Model B drops the B·dq/dt term, so nothing dissipates residual velocity once the bursts end.</w:t>
+        <w:t>Lecture notes §5 and Figure 6: co-contraction adds damping via the force–velocity asymmetry but no stiffness (Lab 03 Extra B).</w:t>
+      </w:r>
+    </w:p>
+    <w:p>
+      <w:pPr>
+        <w:spacing w:after="160" w:line="300"/>
+      </w:pPr>
+      <w:r>
+        <w:rPr>
+          <w:rFonts w:ascii="Cambria" w:cs="Cambria" w:eastAsia="Cambria" w:hAnsi="Cambria"/>
+          <w:color w:val="333333"/>
+          <w:sz w:val="22"/>
+          <w:szCs w:val="22"/>
+        </w:rPr>
+        <w:t>A natural fix is to stiffen the joint by co-contracting harder during the hold. COMPLETE the symmetric hold, then test four levels (0.1, 0.3, 0.5, 0.8) on Model B with the triphasic timing unchanged. All four are plotted against Model A as a reference.</w:t>
+      </w:r>
+      <w:r>
+        <w:rPr>
+          <w:rFonts w:ascii="Cambria" w:cs="Cambria" w:eastAsia="Cambria" w:hAnsi="Cambria"/>
+          <w:b/>
+          <w:bCs/>
+          <w:color w:val="333333"/>
+          <w:sz w:val="22"/>
+          <w:szCs w:val="22"/>
+        </w:rPr>
+      </w:r>
+      <w:r>
+        <w:rPr>
+          <w:rFonts w:ascii="Cambria" w:cs="Cambria" w:eastAsia="Cambria" w:hAnsi="Cambria"/>
+          <w:color w:val="333333"/>
+          <w:sz w:val="22"/>
+          <w:szCs w:val="22"/>
+        </w:rPr>
       </w:r>
     </w:p>
     <w:p>
@@ -998,7 +1042,7 @@
           <w:sz w:val="24"/>
           <w:szCs w:val="24"/>
         </w:rPr>
-        <w:t xml:space="preserve">Task 3.1 — Apply Tuned Triphasic to Model B (5 pts)</w:t>
+        <w:t>Question 3</w:t>
       </w:r>
     </w:p>
     <w:p>
@@ -1012,126 +1056,7 @@
           <w:sz w:val="22"/>
           <w:szCs w:val="22"/>
         </w:rPr>
-        <w:t xml:space="preserve">Apply the </w:t>
-      </w:r>
-      <w:r>
-        <w:rPr>
-          <w:rFonts w:ascii="Cambria" w:cs="Cambria" w:eastAsia="Cambria" w:hAnsi="Cambria"/>
-          <w:b/>
-          <w:bCs/>
-          <w:color w:val="333333"/>
-          <w:sz w:val="22"/>
-          <w:szCs w:val="22"/>
-        </w:rPr>
-        <w:t xml:space="preserve">exact same</w:t>
-      </w:r>
-      <w:r>
-        <w:rPr>
-          <w:rFonts w:ascii="Cambria" w:cs="Cambria" w:eastAsia="Cambria" w:hAnsi="Cambria"/>
-          <w:color w:val="333333"/>
-          <w:sz w:val="22"/>
-          <w:szCs w:val="22"/>
-        </w:rPr>
-        <w:t xml:space="preserve"> activation function to Model B (B = 0). Do not change any parameters.</w:t>
-      </w:r>
-    </w:p>
-    <w:p>
-      <w:pPr>
-        <w:pStyle w:val="Heading2"/>
-        <w:pBdr>
-          <w:bottom w:val="single" w:color="2E86AB" w:sz="1" w:space="4"/>
-        </w:pBdr>
-        <w:spacing w:after="160" w:before="300"/>
-      </w:pPr>
-      <w:r>
-        <w:rPr>
-          <w:rFonts w:ascii="Georgia" w:cs="Georgia" w:eastAsia="Georgia" w:hAnsi="Georgia"/>
-          <w:b/>
-          <w:bCs/>
-          <w:color w:val="2E86AB"/>
-          <w:sz w:val="24"/>
-          <w:szCs w:val="24"/>
-        </w:rPr>
-        <w:t xml:space="preserve">Task 3.2 — Side-by-Side Comparison (10 pts)</w:t>
-      </w:r>
-    </w:p>
-    <w:p>
-      <w:pPr>
-        <w:spacing w:after="160" w:line="300"/>
-      </w:pPr>
-      <w:r>
-        <w:rPr>
-          <w:rFonts w:ascii="Cambria" w:cs="Cambria" w:eastAsia="Cambria" w:hAnsi="Cambria"/>
-          <w:color w:val="333333"/>
-          <w:sz w:val="22"/>
-          <w:szCs w:val="22"/>
-        </w:rPr>
-        <w:t xml:space="preserve">COMPLETE a two-panel figure (displacement and velocity) comparing both models.</w:t>
-      </w:r>
-    </w:p>
-    <w:p>
-      <w:pPr>
-        <w:pStyle w:val="Heading2"/>
-        <w:pBdr>
-          <w:bottom w:val="single" w:color="2E86AB" w:sz="1" w:space="4"/>
-        </w:pBdr>
-        <w:spacing w:after="160" w:before="300"/>
-      </w:pPr>
-      <w:r>
-        <w:rPr>
-          <w:rFonts w:ascii="Georgia" w:cs="Georgia" w:eastAsia="Georgia" w:hAnsi="Georgia"/>
-          <w:b/>
-          <w:bCs/>
-          <w:color w:val="2E86AB"/>
-          <w:sz w:val="24"/>
-          <w:szCs w:val="24"/>
-        </w:rPr>
-        <w:t xml:space="preserve">Question 3.1 (5 pts)</w:t>
-      </w:r>
-    </w:p>
-    <w:p>
-      <w:pPr>
-        <w:spacing w:after="160" w:line="300"/>
-      </w:pPr>
-      <w:r>
-        <w:rPr>
-          <w:rFonts w:ascii="Cambria" w:cs="Cambria" w:eastAsia="Cambria" w:hAnsi="Cambria"/>
-          <w:b/>
-          <w:bCs/>
-          <w:color w:val="333333"/>
-          <w:sz w:val="22"/>
-          <w:szCs w:val="22"/>
-        </w:rPr>
-        <w:t xml:space="preserve">(a)</w:t>
-      </w:r>
-      <w:r>
-        <w:rPr>
-          <w:rFonts w:ascii="Cambria" w:cs="Cambria" w:eastAsia="Cambria" w:hAnsi="Cambria"/>
-          <w:color w:val="333333"/>
-          <w:sz w:val="22"/>
-          <w:szCs w:val="22"/>
-        </w:rPr>
-        <w:t xml:space="preserve"> Does Model B overshoot? Does it settle? </w:t>
-      </w:r>
-      <w:r>
-        <w:rPr>
-          <w:rFonts w:ascii="Cambria" w:cs="Cambria" w:eastAsia="Cambria" w:hAnsi="Cambria"/>
-          <w:b/>
-          <w:bCs/>
-          <w:color w:val="333333"/>
-          <w:sz w:val="22"/>
-          <w:szCs w:val="22"/>
-        </w:rPr>
-        <w:t xml:space="preserve">(b)</w:t>
-      </w:r>
-      <w:r>
-        <w:rPr>
-          <w:rFonts w:ascii="Cambria" w:cs="Cambria" w:eastAsia="Cambria" w:hAnsi="Cambria"/>
-          <w:color w:val="333333"/>
-          <w:sz w:val="22"/>
-          <w:szCs w:val="22"/>
-        </w:rPr>
-        <w:t xml:space="preserve"> What is missing from Model B?</w:t>
+        <w:t>(a) Does more co-contraction let Model B settle?  (b) What is the metabolic cost — where does the energy go?  (c) Why can co-contraction not hold a position, no matter how strong the co-contraction?  (d) How does the λ model's length-dependent activation A = [l − λ + μ·dl/dt]⁺ create stiffness and damping without that cost?</w:t>
       </w:r>
     </w:p>
     <w:p>
@@ -1148,7 +1073,7 @@
           <w:sz w:val="30"/>
           <w:szCs w:val="30"/>
         </w:rPr>
-        <w:t xml:space="preserve">Part 4: Can Co-Contraction Save Model B? (15 pts)</w:t>
+        <w:t>Write-Up — Methods &amp; Results (20 pts)</w:t>
       </w:r>
     </w:p>
     <w:p>
@@ -1159,34 +1084,14 @@
       <w:r>
         <w:rPr>
           <w:rFonts w:ascii="Georgia" w:cs="Georgia" w:eastAsia="Georgia" w:hAnsi="Georgia"/>
-          <w:b/>
+          <w:b w:val="0"/>
           <w:bCs/>
           <w:i/>
-          <w:color w:val="1B2A4A"/>
-          <w:sz w:val="30"/>
+          <w:color w:val="444444"/>
+          <w:sz w:val="20"/>
           <w:szCs w:val="30"/>
         </w:rPr>
-        <w:t>Lecture notes §5 and Figure 6: co-contraction adds damping via the force–velocity asymmetry but no stiffness (Lab 03 Extra B).</w:t>
-      </w:r>
-    </w:p>
-    <w:p>
-      <w:pPr>
-        <w:pStyle w:val="Heading2"/>
-        <w:pBdr>
-          <w:bottom w:val="single" w:color="2E86AB" w:sz="1" w:space="4"/>
-        </w:pBdr>
-        <w:spacing w:after="160" w:before="300"/>
-      </w:pPr>
-      <w:r>
-        <w:rPr>
-          <w:rFonts w:ascii="Georgia" w:cs="Georgia" w:eastAsia="Georgia" w:hAnsi="Georgia"/>
-          <w:b/>
-          <w:bCs/>
-          <w:color w:val="2E86AB"/>
-          <w:sz w:val="24"/>
-          <w:szCs w:val="24"/>
-        </w:rPr>
-        <w:t xml:space="preserve">Task 4.1 — Test Four Co-Contraction Levels (10 pts)</w:t>
+        <w:t>Objective. Report the comparison as a scientific result, in the form used for every homework in this course.</w:t>
       </w:r>
     </w:p>
     <w:p>
@@ -1200,27 +1105,7 @@
           <w:sz w:val="22"/>
           <w:szCs w:val="22"/>
         </w:rPr>
-        <w:t xml:space="preserve">Test hold levels of 0.1, 0.3, 0.5, and 0.8 on Model B. Plot all against Model A reference.</w:t>
-      </w:r>
-    </w:p>
-    <w:p>
-      <w:pPr>
-        <w:pStyle w:val="Heading2"/>
-        <w:pBdr>
-          <w:bottom w:val="single" w:color="2E86AB" w:sz="1" w:space="4"/>
-        </w:pBdr>
-        <w:spacing w:after="160" w:before="300"/>
-      </w:pPr>
-      <w:r>
-        <w:rPr>
-          <w:rFonts w:ascii="Georgia" w:cs="Georgia" w:eastAsia="Georgia" w:hAnsi="Georgia"/>
-          <w:b/>
-          <w:bCs/>
-          <w:color w:val="2E86AB"/>
-          <w:sz w:val="24"/>
-          <w:szCs w:val="24"/>
-        </w:rPr>
-        <w:t xml:space="preserve">Question 4.1 (5 pts)</w:t>
+        <w:t>Write a Methods and Results section (400–600 words), third person, past tense. Methods (~200 words): the two models (per lecture Eq 4.3), your triphasic pattern (report the parameters and justify the antagonist timing using the HW02 delay), and how you compared them.</w:t>
       </w:r>
     </w:p>
     <w:p>
@@ -1236,179 +1121,69 @@
           <w:sz w:val="22"/>
           <w:szCs w:val="22"/>
         </w:rPr>
-        <w:t xml:space="preserve">(a)</w:t>
-      </w:r>
-      <w:r>
-        <w:rPr>
-          <w:rFonts w:ascii="Cambria" w:cs="Cambria" w:eastAsia="Cambria" w:hAnsi="Cambria"/>
-          <w:color w:val="333333"/>
-          <w:sz w:val="22"/>
-          <w:szCs w:val="22"/>
-        </w:rPr>
-        <w:t xml:space="preserve"> Does co-contraction help? </w:t>
-      </w:r>
-      <w:r>
-        <w:rPr>
-          <w:rFonts w:ascii="Cambria" w:cs="Cambria" w:eastAsia="Cambria" w:hAnsi="Cambria"/>
-          <w:b/>
-          <w:bCs/>
-          <w:color w:val="333333"/>
-          <w:sz w:val="22"/>
-          <w:szCs w:val="22"/>
-        </w:rPr>
-        <w:t xml:space="preserve">(b)</w:t>
-      </w:r>
-      <w:r>
-        <w:rPr>
-          <w:rFonts w:ascii="Cambria" w:cs="Cambria" w:eastAsia="Cambria" w:hAnsi="Cambria"/>
-          <w:color w:val="333333"/>
-          <w:sz w:val="22"/>
-          <w:szCs w:val="22"/>
-        </w:rPr>
-        <w:t xml:space="preserve"> Metabolic cost? </w:t>
-      </w:r>
-      <w:r>
-        <w:rPr>
-          <w:rFonts w:ascii="Cambria" w:cs="Cambria" w:eastAsia="Cambria" w:hAnsi="Cambria"/>
-          <w:b/>
-          <w:bCs/>
-          <w:color w:val="333333"/>
-          <w:sz w:val="22"/>
-          <w:szCs w:val="22"/>
-        </w:rPr>
-        <w:t xml:space="preserve">(c)</w:t>
-      </w:r>
-      <w:r>
-        <w:rPr>
-          <w:rFonts w:ascii="Cambria" w:cs="Cambria" w:eastAsia="Cambria" w:hAnsi="Cambria"/>
-          <w:color w:val="333333"/>
-          <w:sz w:val="22"/>
-          <w:szCs w:val="22"/>
-        </w:rPr>
-        <w:t xml:space="preserve"> How would the λ model (​A = [l − λ]⁺​) solve this without co-contraction?</w:t>
-      </w:r>
-      <w:r>
-        <w:rPr>
-          <w:rFonts w:ascii="Cambria" w:cs="Cambria" w:eastAsia="Cambria" w:hAnsi="Cambria"/>
-          <w:b/>
-          <w:bCs/>
-          <w:color w:val="333333"/>
-          <w:sz w:val="22"/>
-          <w:szCs w:val="22"/>
-        </w:rPr>
-        <w:t xml:space="preserve"> (d)</w:t>
-      </w:r>
-      <w:r>
-        <w:rPr>
-          <w:rFonts w:ascii="Cambria" w:cs="Cambria" w:eastAsia="Cambria" w:hAnsi="Cambria"/>
-          <w:color w:val="333333"/>
-          <w:sz w:val="22"/>
-          <w:szCs w:val="22"/>
-        </w:rPr>
-        <w:t xml:space="preserve"> Does a = 0.8 actually stabilize Model B? Compare its settling behavior and total isometric force to Model A.</w:t>
-      </w:r>
-    </w:p>
-    <w:p>
-      <w:pPr>
-        <w:pStyle w:val="Heading1"/>
-        <w:spacing w:after="200" w:before="360"/>
-      </w:pPr>
-      <w:r>
-        <w:rPr>
-          <w:rFonts w:ascii="Georgia" w:cs="Georgia" w:eastAsia="Georgia" w:hAnsi="Georgia"/>
-          <w:b/>
-          <w:bCs/>
-          <w:color w:val="1B2A4A"/>
-          <w:sz w:val="30"/>
-          <w:szCs w:val="30"/>
-        </w:rPr>
-        <w:t xml:space="preserve">Part 5: HW02 Comparison + Write-Up (25 pts)</w:t>
-      </w:r>
-    </w:p>
-    <w:p>
-      <w:pPr>
-        <w:pStyle w:val="Heading1"/>
-        <w:spacing w:after="200" w:before="360"/>
-      </w:pPr>
-      <w:r>
-        <w:rPr>
-          <w:rFonts w:ascii="Georgia" w:cs="Georgia" w:eastAsia="Georgia" w:hAnsi="Georgia"/>
-          <w:b/>
-          <w:bCs/>
-          <w:i/>
-          <w:color w:val="1B2A4A"/>
-          <w:sz w:val="30"/>
-          <w:szCs w:val="30"/>
-        </w:rPr>
-        <w:t>Lecture notes §3–§5: the full simulation includes interaction and Coriolis torques and configuration-dependent inertia that the HW02 estimate ignores.</w:t>
-      </w:r>
-    </w:p>
-    <w:p>
-      <w:pPr>
-        <w:pStyle w:val="Heading2"/>
-        <w:pBdr>
-          <w:bottom w:val="single" w:color="2E86AB" w:sz="1" w:space="4"/>
-        </w:pBdr>
-        <w:spacing w:after="160" w:before="300"/>
-      </w:pPr>
-      <w:r>
-        <w:rPr>
-          <w:rFonts w:ascii="Georgia" w:cs="Georgia" w:eastAsia="Georgia" w:hAnsi="Georgia"/>
-          <w:b/>
-          <w:bCs/>
-          <w:color w:val="2E86AB"/>
-          <w:sz w:val="24"/>
-          <w:szCs w:val="24"/>
-        </w:rPr>
-        <w:t xml:space="preserve">Task 5.1 — Compare to HW02 Prediction (10 pts)</w:t>
-      </w:r>
-    </w:p>
-    <w:p>
-      <w:pPr>
-        <w:spacing w:after="160" w:line="300"/>
-      </w:pPr>
-      <w:r>
-        <w:rPr>
-          <w:rFonts w:ascii="Cambria" w:cs="Cambria" w:eastAsia="Cambria" w:hAnsi="Cambria"/>
-          <w:color w:val="333333"/>
-          <w:sz w:val="22"/>
-          <w:szCs w:val="22"/>
-        </w:rPr>
-        <w:t xml:space="preserve">Compute peak hand velocity × 58 ms (HW02 method). Compare to full dynamics simulation.</w:t>
-      </w:r>
-    </w:p>
-    <w:p>
-      <w:pPr>
-        <w:pStyle w:val="Heading2"/>
-        <w:pBdr>
-          <w:bottom w:val="single" w:color="2E86AB" w:sz="1" w:space="4"/>
-        </w:pBdr>
-        <w:spacing w:after="160" w:before="300"/>
-      </w:pPr>
-      <w:r>
-        <w:rPr>
-          <w:rFonts w:ascii="Georgia" w:cs="Georgia" w:eastAsia="Georgia" w:hAnsi="Georgia"/>
-          <w:b/>
-          <w:bCs/>
-          <w:color w:val="2E86AB"/>
-          <w:sz w:val="24"/>
-          <w:szCs w:val="24"/>
-        </w:rPr>
-        <w:t xml:space="preserve">Task 5.2 — Methods &amp; Results Write-Up (15 pts)</w:t>
-      </w:r>
-    </w:p>
-    <w:p>
-      <w:pPr>
-        <w:spacing w:after="160" w:line="300"/>
-      </w:pPr>
-      <w:r>
-        <w:rPr>
-          <w:rFonts w:ascii="Cambria" w:cs="Cambria" w:eastAsia="Cambria" w:hAnsi="Cambria"/>
-          <w:color w:val="333333"/>
-          <w:sz w:val="22"/>
-          <w:szCs w:val="22"/>
-        </w:rPr>
-        <w:t xml:space="preserve">Write a Methods and Results section (400–600 words).</w:t>
+        <w:t>Results (~200–400 words): (1) Model A reaches ~5 cm, holds it, and has a bell-shaped velocity profile; (2) Model B fails to settle; (3) co-contraction only partly helps, at metabolic cost; (4) conclude that direct activation lacks the intrinsic damping and stiffness for stable reaching, motivating the λ model. Include two figures: the Model A vs B comparison (Task 2) and the co-contraction comparison (Task 3).</w:t>
+      </w:r>
+      <w:r>
+        <w:rPr>
+          <w:rFonts w:ascii="Cambria" w:cs="Cambria" w:eastAsia="Cambria" w:hAnsi="Cambria"/>
+          <w:color w:val="333333"/>
+          <w:sz w:val="22"/>
+          <w:szCs w:val="22"/>
+        </w:rPr>
+      </w:r>
+      <w:r>
+        <w:rPr>
+          <w:rFonts w:ascii="Cambria" w:cs="Cambria" w:eastAsia="Cambria" w:hAnsi="Cambria"/>
+          <w:b/>
+          <w:bCs/>
+          <w:color w:val="333333"/>
+          <w:sz w:val="22"/>
+          <w:szCs w:val="22"/>
+        </w:rPr>
+      </w:r>
+      <w:r>
+        <w:rPr>
+          <w:rFonts w:ascii="Cambria" w:cs="Cambria" w:eastAsia="Cambria" w:hAnsi="Cambria"/>
+          <w:color w:val="333333"/>
+          <w:sz w:val="22"/>
+          <w:szCs w:val="22"/>
+        </w:rPr>
+      </w:r>
+      <w:r>
+        <w:rPr>
+          <w:rFonts w:ascii="Cambria" w:cs="Cambria" w:eastAsia="Cambria" w:hAnsi="Cambria"/>
+          <w:b/>
+          <w:bCs/>
+          <w:color w:val="333333"/>
+          <w:sz w:val="22"/>
+          <w:szCs w:val="22"/>
+        </w:rPr>
+      </w:r>
+      <w:r>
+        <w:rPr>
+          <w:rFonts w:ascii="Cambria" w:cs="Cambria" w:eastAsia="Cambria" w:hAnsi="Cambria"/>
+          <w:color w:val="333333"/>
+          <w:sz w:val="22"/>
+          <w:szCs w:val="22"/>
+        </w:rPr>
+      </w:r>
+      <w:r>
+        <w:rPr>
+          <w:rFonts w:ascii="Cambria" w:cs="Cambria" w:eastAsia="Cambria" w:hAnsi="Cambria"/>
+          <w:b/>
+          <w:bCs/>
+          <w:color w:val="333333"/>
+          <w:sz w:val="22"/>
+          <w:szCs w:val="22"/>
+        </w:rPr>
+      </w:r>
+      <w:r>
+        <w:rPr>
+          <w:rFonts w:ascii="Cambria" w:cs="Cambria" w:eastAsia="Cambria" w:hAnsi="Cambria"/>
+          <w:color w:val="333333"/>
+          <w:sz w:val="22"/>
+          <w:szCs w:val="22"/>
+        </w:rPr>
       </w:r>
     </w:p>
     <w:tbl>
@@ -1488,11 +1263,6 @@
         </w:tc>
       </w:tr>
     </w:tbl>
-    <w:p>
-      <w:pPr>
-        <w:spacing w:before="80"/>
-      </w:pPr>
-    </w:p>
     <w:tbl>
       <w:tblPr>
         <w:tblW w:type="dxa" w:w="9360"/>
@@ -1559,36 +1329,6 @@
         </w:tc>
       </w:tr>
     </w:tbl>
-    <w:p>
-      <w:pPr>
-        <w:spacing w:before="100"/>
-      </w:pPr>
-    </w:p>
-    <w:p>
-      <w:pPr>
-        <w:spacing w:after="160" w:line="300"/>
-      </w:pPr>
-      <w:r>
-        <w:rPr>
-          <w:rFonts w:ascii="Cambria" w:cs="Cambria" w:eastAsia="Cambria" w:hAnsi="Cambria"/>
-          <w:b/>
-          <w:bCs/>
-          <w:color w:val="333333"/>
-          <w:sz w:val="22"/>
-          <w:szCs w:val="22"/>
-        </w:rPr>
-        <w:t xml:space="preserve">Include two figures.</w:t>
-      </w:r>
-      <w:r>
-        <w:rPr>
-          <w:rFonts w:ascii="Cambria" w:cs="Cambria" w:eastAsia="Cambria" w:hAnsi="Cambria"/>
-          <w:color w:val="333333"/>
-          <w:sz w:val="22"/>
-          <w:szCs w:val="22"/>
-        </w:rPr>
-        <w:t xml:space="preserve"> Format: third person, past tense.</w:t>
-      </w:r>
-    </w:p>
     <w:p>
       <w:pPr>
         <w:pStyle w:val="Heading1"/>
@@ -1711,17 +1451,8 @@
             </w:tcMar>
           </w:tcPr>
           <w:p>
-            <w:pPr>
-              <w:spacing w:after="0"/>
-            </w:pPr>
-            <w:r>
-              <w:rPr>
-                <w:rFonts w:ascii="Cambria" w:cs="Cambria" w:eastAsia="Cambria" w:hAnsi="Cambria"/>
-                <w:color w:val="333333"/>
-                <w:sz w:val="20"/>
-                <w:szCs w:val="20"/>
-              </w:rPr>
-              <w:t xml:space="preserve">Part 1: Agonist Only</w:t>
+            <w:r>
+              <w:t>Task 1: Build a ballistic reach (Model A)</w:t>
             </w:r>
           </w:p>
         </w:tc>
@@ -1743,17 +1474,8 @@
             </w:tcMar>
           </w:tcPr>
           <w:p>
-            <w:pPr>
-              <w:spacing w:after="0"/>
-            </w:pPr>
-            <w:r>
-              <w:rPr>
-                <w:rFonts w:ascii="Cambria" w:cs="Cambria" w:eastAsia="Cambria" w:hAnsi="Cambria"/>
-                <w:color w:val="333333"/>
-                <w:sz w:val="20"/>
-                <w:szCs w:val="20"/>
-              </w:rPr>
-              <w:t xml:space="preserve">15 pts</w:t>
+            <w:r>
+              <w:t>40 pts</w:t>
             </w:r>
           </w:p>
         </w:tc>
@@ -1776,17 +1498,8 @@
             </w:tcMar>
           </w:tcPr>
           <w:p>
-            <w:pPr>
-              <w:spacing w:after="0"/>
-            </w:pPr>
-            <w:r>
-              <w:rPr>
-                <w:rFonts w:ascii="Cambria" w:cs="Cambria" w:eastAsia="Cambria" w:hAnsi="Cambria"/>
-                <w:color w:val="333333"/>
-                <w:sz w:val="20"/>
-                <w:szCs w:val="20"/>
-              </w:rPr>
-              <w:t xml:space="preserve">Part 2: Design the Triphasic Reach (Model A)</w:t>
+            <w:r>
+              <w:t>Task 2: Break it — the same pattern on Model B</w:t>
             </w:r>
           </w:p>
         </w:tc>
@@ -1807,17 +1520,8 @@
             </w:tcMar>
           </w:tcPr>
           <w:p>
-            <w:pPr>
-              <w:spacing w:after="0"/>
-            </w:pPr>
-            <w:r>
-              <w:rPr>
-                <w:rFonts w:ascii="Cambria" w:cs="Cambria" w:eastAsia="Cambria" w:hAnsi="Cambria"/>
-                <w:color w:val="333333"/>
-                <w:sz w:val="20"/>
-                <w:szCs w:val="20"/>
-              </w:rPr>
-              <w:t xml:space="preserve">25 pts</w:t>
+            <w:r>
+              <w:t>20 pts</w:t>
             </w:r>
           </w:p>
         </w:tc>
@@ -1841,17 +1545,8 @@
             </w:tcMar>
           </w:tcPr>
           <w:p>
-            <w:pPr>
-              <w:spacing w:after="0"/>
-            </w:pPr>
-            <w:r>
-              <w:rPr>
-                <w:rFonts w:ascii="Cambria" w:cs="Cambria" w:eastAsia="Cambria" w:hAnsi="Cambria"/>
-                <w:color w:val="333333"/>
-                <w:sz w:val="20"/>
-                <w:szCs w:val="20"/>
-              </w:rPr>
-              <w:t xml:space="preserve">Part 3: Same Pattern on Model B</w:t>
+            <w:r>
+              <w:t>Task 3: Can co-contraction rescue Model B?</w:t>
             </w:r>
           </w:p>
         </w:tc>
@@ -1873,17 +1568,8 @@
             </w:tcMar>
           </w:tcPr>
           <w:p>
-            <w:pPr>
-              <w:spacing w:after="0"/>
-            </w:pPr>
-            <w:r>
-              <w:rPr>
-                <w:rFonts w:ascii="Cambria" w:cs="Cambria" w:eastAsia="Cambria" w:hAnsi="Cambria"/>
-                <w:color w:val="333333"/>
-                <w:sz w:val="20"/>
-                <w:szCs w:val="20"/>
-              </w:rPr>
-              <w:t xml:space="preserve">20 pts</w:t>
+            <w:r>
+              <w:t>20 pts</w:t>
             </w:r>
           </w:p>
         </w:tc>
@@ -1906,17 +1592,8 @@
             </w:tcMar>
           </w:tcPr>
           <w:p>
-            <w:pPr>
-              <w:spacing w:after="0"/>
-            </w:pPr>
-            <w:r>
-              <w:rPr>
-                <w:rFonts w:ascii="Cambria" w:cs="Cambria" w:eastAsia="Cambria" w:hAnsi="Cambria"/>
-                <w:color w:val="333333"/>
-                <w:sz w:val="20"/>
-                <w:szCs w:val="20"/>
-              </w:rPr>
-              <w:t xml:space="preserve">Part 4: Can Co-Contraction Save Model B?</w:t>
+            <w:r>
+              <w:t>Write-Up: Methods &amp; Results</w:t>
             </w:r>
           </w:p>
         </w:tc>
@@ -1937,17 +1614,8 @@
             </w:tcMar>
           </w:tcPr>
           <w:p>
-            <w:pPr>
-              <w:spacing w:after="0"/>
-            </w:pPr>
-            <w:r>
-              <w:rPr>
-                <w:rFonts w:ascii="Cambria" w:cs="Cambria" w:eastAsia="Cambria" w:hAnsi="Cambria"/>
-                <w:color w:val="333333"/>
-                <w:sz w:val="20"/>
-                <w:szCs w:val="20"/>
-              </w:rPr>
-              <w:t xml:space="preserve">15 pts</w:t>
+            <w:r>
+              <w:t>20 pts</w:t>
             </w:r>
           </w:p>
         </w:tc>
@@ -1971,17 +1639,8 @@
             </w:tcMar>
           </w:tcPr>
           <w:p>
-            <w:pPr>
-              <w:spacing w:after="0"/>
-            </w:pPr>
-            <w:r>
-              <w:rPr>
-                <w:rFonts w:ascii="Cambria" w:cs="Cambria" w:eastAsia="Cambria" w:hAnsi="Cambria"/>
-                <w:color w:val="333333"/>
-                <w:sz w:val="20"/>
-                <w:szCs w:val="20"/>
-              </w:rPr>
-              <w:t xml:space="preserve">Part 5: HW02 Comparison + Write-Up</w:t>
+            <w:r>
+              <w:t>Total</w:t>
             </w:r>
           </w:p>
         </w:tc>
@@ -2003,83 +1662,8 @@
             </w:tcMar>
           </w:tcPr>
           <w:p>
-            <w:pPr>
-              <w:spacing w:after="0"/>
-            </w:pPr>
-            <w:r>
-              <w:rPr>
-                <w:rFonts w:ascii="Cambria" w:cs="Cambria" w:eastAsia="Cambria" w:hAnsi="Cambria"/>
-                <w:color w:val="333333"/>
-                <w:sz w:val="20"/>
-                <w:szCs w:val="20"/>
-              </w:rPr>
-              <w:t xml:space="preserve">25 pts</w:t>
-            </w:r>
-          </w:p>
-        </w:tc>
-      </w:tr>
-      <w:tr>
-        <w:tc>
-          <w:tcPr>
-            <w:tcW w:type="dxa" w:w="6000"/>
-            <w:tcBorders>
-              <w:top w:val="single" w:color="B8C9D9" w:sz="1"/>
-              <w:left w:val="single" w:color="B8C9D9" w:sz="1"/>
-              <w:bottom w:val="single" w:color="B8C9D9" w:sz="1"/>
-              <w:right w:val="single" w:color="B8C9D9" w:sz="1"/>
-            </w:tcBorders>
-            <w:shd w:fill="E8F1F8" w:val="clear"/>
-            <w:tcMar>
-              <w:top w:type="dxa" w:w="60"/>
-              <w:left w:type="dxa" w:w="120"/>
-              <w:bottom w:type="dxa" w:w="60"/>
-              <w:right w:type="dxa" w:w="120"/>
-            </w:tcMar>
-          </w:tcPr>
-          <w:p>
-            <w:pPr>
-              <w:spacing w:after="0"/>
-            </w:pPr>
-            <w:r>
-              <w:rPr>
-                <w:rFonts w:ascii="Cambria" w:cs="Cambria" w:eastAsia="Cambria" w:hAnsi="Cambria"/>
-                <w:color w:val="333333"/>
-                <w:sz w:val="20"/>
-                <w:szCs w:val="20"/>
-              </w:rPr>
-              <w:t xml:space="preserve">Total</w:t>
-            </w:r>
-          </w:p>
-        </w:tc>
-        <w:tc>
-          <w:tcPr>
-            <w:tcW w:type="dxa" w:w="3360"/>
-            <w:tcBorders>
-              <w:top w:val="single" w:color="B8C9D9" w:sz="1"/>
-              <w:left w:val="single" w:color="B8C9D9" w:sz="1"/>
-              <w:bottom w:val="single" w:color="B8C9D9" w:sz="1"/>
-              <w:right w:val="single" w:color="B8C9D9" w:sz="1"/>
-            </w:tcBorders>
-            <w:shd w:fill="E8F1F8" w:val="clear"/>
-            <w:tcMar>
-              <w:top w:type="dxa" w:w="60"/>
-              <w:left w:type="dxa" w:w="120"/>
-              <w:bottom w:type="dxa" w:w="60"/>
-              <w:right w:type="dxa" w:w="120"/>
-            </w:tcMar>
-          </w:tcPr>
-          <w:p>
-            <w:pPr>
-              <w:spacing w:after="0"/>
-            </w:pPr>
-            <w:r>
-              <w:rPr>
-                <w:rFonts w:ascii="Cambria" w:cs="Cambria" w:eastAsia="Cambria" w:hAnsi="Cambria"/>
-                <w:color w:val="333333"/>
-                <w:sz w:val="20"/>
-                <w:szCs w:val="20"/>
-              </w:rPr>
-              <w:t xml:space="preserve">100 pts</w:t>
+            <w:r>
+              <w:t>100 pts</w:t>
             </w:r>
           </w:p>
         </w:tc>

</xml_diff>